<commit_message>
Proofread site and update syllabus wording
- Fix homepage wording (term dates, workload, recitation, time zone,
  AI policy) and show the capstone due date in the schedule.
- Regenerate schedule and syllabus pages from the revised syllabus:
  clearer readings and glossary, forward-pass focus for Week 9 and T1.

Co-Authored-By: Claude Opus 5.5 <noreply@anthropic.com>
</commit_message>
<xml_diff>
--- a/dist/assets/syllabus-spring-2027.docx
+++ b/dist/assets/syllabus-spring-2027.docx
@@ -630,7 +630,7 @@
           <w:rFonts w:ascii="Arial" w:cs="Arial" w:eastAsia="Arial" w:hAnsi="Arial"/>
           <w:b w:val="0"/>
         </w:rPr>
-        <w:t>Explain autograd, operator dispatch, and graph compilation; compare PyTorch and JAX execution.</w:t>
+        <w:t>Explain how frameworks execute the forward pass through operator dispatch and graph compilation, and what automatic differentiation adds in memory and time; compare PyTorch and JAX execution.</w:t>
       </w:r>
     </w:p>
     <w:p>
@@ -2396,7 +2396,7 @@
           <w:b w:val="0"/>
           <w:bCs/>
         </w:rPr>
-        <w:t xml:space="preserve"> Python, PySpark, and Parquet for data; PyTorch for the main training exercises; JAX for guided comparisons of differentiation, vectorization, and compilation; Triton for a small GPU kernel.</w:t>
+        <w:t xml:space="preserve"> Python, PySpark, and Parquet for data; PyTorch for the main training exercises; JAX for guided comparisons of vectorization and compilation; Triton for a small GPU kernel.</w:t>
       </w:r>
     </w:p>
     <w:p>
@@ -3813,7 +3813,7 @@
                 <w:sz w:val="18"/>
                 <w:szCs w:val="18"/>
               </w:rPr>
-              <w:t>Implement one Triton reduction or fused elementwise kernel and validate it against PyTorch. Integrate it into a supplied workload using your D3 dataset; compare PyTorch eager and compiled execution and a guided JAX equivalent. Model, autograd, optimizer, and data loader are provided. Checkpoint: correct kernel and timing harness.</w:t>
+              <w:t>Implement one Triton reduction or fused elementwise kernel and validate it against PyTorch. Integrate it into the forward pass of a supplied workload using your D3 dataset; compare PyTorch eager and compiled execution and a guided JAX equivalent. Model, autograd, optimizer, and data loader are provided. Checkpoint: correct kernel and timing harness.</w:t>
             </w:r>
           </w:p>
           <w:p>
@@ -4363,7 +4363,7 @@
           <w:rFonts w:ascii="Arial" w:cs="Arial" w:eastAsia="Arial" w:hAnsi="Arial"/>
           <w:b w:val="0"/>
         </w:rPr>
-        <w:t>Week 1 introduces the complete system. Jermaine teaches both lectures in Weeks 2–7; Wang teaches both in Weeks 8–13. Week 14 returns to joint integration and review. The 12 training lectures cover GPUs (2), frameworks (3), distributed programming (3), parallelism (3), and diagnosis (1). Work is due Fridays at 11:59 p.m. unless noted. No assignment is due in the midterm week.</w:t>
+        <w:t>Week 1 introduces the complete system. Jermaine teaches both lectures in Weeks 2–7; Wang teaches both in Weeks 8–13. Week 14 returns to joint integration and review. The 12 training lectures cover GPUs (2), frameworks (3), distributed programming (3), parallelism (3), and diagnosis (1). Work is due Fridays at 11:59 p.m. Central Time unless noted. No assignment is due in the midterm week.</w:t>
       </w:r>
     </w:p>
     <w:tbl>
@@ -6413,7 +6413,7 @@
                 <w:sz w:val="18"/>
                 <w:szCs w:val="18"/>
               </w:rPr>
-              <w:t>T1 and Lab 3 out after midterm and Lecture 2</w:t>
+              <w:t>T1 and Lab 3 out (after midterm and Lecture 2)</w:t>
             </w:r>
           </w:p>
         </w:tc>
@@ -6502,7 +6502,7 @@
                 <w:sz w:val="18"/>
                 <w:szCs w:val="18"/>
               </w:rPr>
-              <w:t>PyTorch tensors, storage/layout, autograd, and operator dispatch.</w:t>
+              <w:t>PyTorch tensors, storage/layout, operator dispatch, and the forward pass; autograd as a provided tool.</w:t>
             </w:r>
             <w:r>
               <w:rPr>
@@ -6575,7 +6575,7 @@
                 <w:sz w:val="18"/>
                 <w:szCs w:val="18"/>
               </w:rPr>
-              <w:t>PyTorch eager and compiled execution; JAX grad, vmap, and jit; tracing and graph breaks.</w:t>
+              <w:t>PyTorch eager and compiled execution; JAX vmap and jit; tracing and graph breaks.</w:t>
             </w:r>
             <w:r>
               <w:rPr>
@@ -8500,7 +8500,7 @@
           <w:rFonts w:ascii="Arial" w:cs="Arial" w:eastAsia="Arial" w:hAnsi="Arial"/>
           <w:b w:val="0"/>
         </w:rPr>
-        <w:t>PyTorch documentation: tensors, autograd, operator dispatch, and torch.compile; JAX documentation: grad, vmap, jit, and asynchronous execution.</w:t>
+        <w:t>PyTorch documentation: tensors, operator dispatch, and torch.compile; JAX documentation: vmap, jit, and asynchronous execution.</w:t>
       </w:r>
       <w:r>
         <w:t xml:space="preserve"> </w:t>
@@ -8515,7 +8515,7 @@
         </w:r>
       </w:hyperlink>
       <w:r>
-        <w:t xml:space="preserve"> </w:t>
+        <w:t xml:space="preserve"> · </w:t>
       </w:r>
       <w:hyperlink r:id="rId11">
         <w:r>
@@ -8527,7 +8527,7 @@
         </w:r>
       </w:hyperlink>
       <w:r>
-        <w:t xml:space="preserve"> </w:t>
+        <w:t xml:space="preserve"> · </w:t>
       </w:r>
       <w:hyperlink r:id="rId12">
         <w:r>
@@ -8600,7 +8600,7 @@
         </w:r>
       </w:hyperlink>
       <w:r>
-        <w:t xml:space="preserve"> </w:t>
+        <w:t xml:space="preserve"> · </w:t>
       </w:r>
       <w:hyperlink r:id="rId14">
         <w:r>
@@ -8671,7 +8671,24 @@
           <w:rFonts w:ascii="Arial" w:cs="Arial" w:eastAsia="Arial" w:hAnsi="Arial"/>
           <w:b w:val="0"/>
         </w:rPr>
-        <w:t>Bengio et al., “A Neural Probabilistic Language Model,” JMLR 2003, for the supplied workload. Thakur, Rabenseifner, and Gropp, “Optimization of Collective Communication Operations in MPICH,” IJHPCA 2005, for collective cost models.</w:t>
+        <w:t>Bengio et al., “A Neural Probabilistic Language Model,” JMLR 2003, for the supplied workload.</w:t>
+      </w:r>
+    </w:p>
+    <w:p>
+      <w:pPr>
+        <w:pStyle w:val="ListParagraph"/>
+        <w:numPr>
+          <w:ilvl w:val="0"/>
+          <w:numId w:val="3"/>
+        </w:numPr>
+        <w:spacing w:after="60" w:line="264"/>
+      </w:pPr>
+      <w:r>
+        <w:rPr>
+          <w:rFonts w:ascii="Arial" w:cs="Arial" w:eastAsia="Arial" w:hAnsi="Arial"/>
+          <w:b w:val="0"/>
+        </w:rPr>
+        <w:t>Thakur, Rabenseifner, and Gropp, “Optimization of Collective Communication Operations in MPICH,” IJHPCA 2005, for collective cost models.</w:t>
       </w:r>
     </w:p>
     <w:p>
@@ -10127,7 +10144,7 @@
                 <w:sz w:val="18"/>
                 <w:szCs w:val="18"/>
               </w:rPr>
-              <w:t>Partition examples across workers and synchronize gradients; computation is replicated, while model state may also be sharded.</w:t>
+              <w:t>Partition examples across workers and synchronize gradients; the model is replicated, though its state may also be sharded.</w:t>
             </w:r>
           </w:p>
         </w:tc>

</xml_diff>